<commit_message>
Implement 4-tier CPR grading scale (5: >86%, 4: 74-86%, 3: 56-73%, 2: <56%) with official protocol and voice feedback
</commit_message>
<xml_diff>
--- a/GD_H126_Bemor_Maniken_Loyiha_va_Video_Ssenariy.docx
+++ b/GD_H126_Bemor_Maniken_Loyiha_va_Video_Ssenariy.docx
@@ -701,7 +701,26 @@
         <w:rPr>
           <w:sz w:val="21"/>
         </w:rPr>
-        <w:t>Imtihon muvaffaqiyatli topshirilganda (≥80% ball va to'g'ri CPR), maniken ko'kragi mustaqil 3.6 soniyalik ritmda nafas oladi, ko'zlari ochiladi, 75 BPM sinus puls tiklanadi, konfetti otiladi va bemor o'zbek tilida minnatdorchilik bildiradi.</w:t>
+        <w:t>Imtihon muvaffaqiyatli topshirilganda (3, 4 yoki 5 baho olganda), maniken ko'kragi mustaqil 3.6 soniyalik ritmda nafas oladi, ko'zlari ochiladi, 75 BPM sinus puls tiklanadi, konfetti otiladi va bemor o'zbek tilida minnatdorchilik bildiradi.</w:t>
+      </w:r>
+    </w:p>
+    <w:p>
+      <w:pPr>
+        <w:pStyle w:val="ListBullet"/>
+        <w:spacing w:after="80"/>
+      </w:pPr>
+      <w:r>
+        <w:rPr>
+          <w:b/>
+          <w:color w:val="0F172A"/>
+        </w:rPr>
+        <w:t xml:space="preserve">4 Bosqichli Milliy Baholash Tizimi: </w:t>
+      </w:r>
+      <w:r>
+        <w:rPr>
+          <w:sz w:val="21"/>
+        </w:rPr>
+        <w:t>Talabalar natijasi rasmiy mezon bo'yicha baholanadi: &gt;86% — 5 Baho (A'lo), 74%–86% — 4 Baho (Yaxshi), 56%–73% — 3 Baho (Qoniqarli), &lt;56% — 2 Baho (Qoniqarsiz/Yiqildi).</w:t>
       </w:r>
     </w:p>
     <w:p>
@@ -720,7 +739,7 @@
         <w:rPr>
           <w:sz w:val="21"/>
         </w:rPr>
-        <w:t>Imtihon yakunida rasmiy muhrlangan, talaba va o'qituvchi imzolari qo'yiladigan A4 protokoli printerga chiqariladi yoki PDF qilib saqlanadi.</w:t>
+        <w:t>Imtihon yakunida rasmiy muhrlangan, bahosi (5/4/3/2), talaba va o'qituvchi imzolari qo'yiladigan A4 protokoli printerga chiqariladi yoki PDF qilib saqlanadi.</w:t>
       </w:r>
     </w:p>
     <w:p>
@@ -739,7 +758,7 @@
         <w:rPr>
           <w:sz w:val="21"/>
         </w:rPr>
-        <w:t>Barcha talabalar natijalari brauzer xotirasida doimiy saqlanadi. Natijalarni qidirish, o'tgan/yiqilgan bo'yicha filtrlash va saralash funksiyalari mavjud.</w:t>
+        <w:t>Barcha talabalar natijalari brauzer xotirasida doimiy saqlanadi. Natijalarni baho (5, 4, 3, 2), o'tgan/yiqilgan bo'yicha filtrlash va saralash funksiyalari mavjud.</w:t>
       </w:r>
     </w:p>
     <w:p>

</xml_diff>